<commit_message>
Kịch bản 7–10 phút: cập nhật theo bản trình chiếu mới (phần, tiêu đề trang, thao tác bấm, tên tác giả)
Co-Authored-By: Claude Opus 5.5 <noreply@anthropic.com>
Claude-Session: https://claude.ai/code/session_01BbeuRQLqGZzWD47vVGju5M
</commit_message>
<xml_diff>
--- a/KichBan_ThuyetTrinh_7-10phut_GiaDinhBao.docx
+++ b/KichBan_ThuyetTrinh_7-10phut_GiaDinhBao.docx
@@ -30,7 +30,7 @@
           <w:sz w:val="24"/>
           <w:szCs w:val="24"/>
         </w:rPr>
-        <w:t xml:space="preserve">학술대회 발표 대본 — 7~10분 (발표자료: 표지 + 슬라이드 1–15 + 참고문헌·감사 · 베트남어·한국어 대역)</w:t>
+        <w:t xml:space="preserve">학술대회 발표 대본 — 7~10분 (발표자료: 표지 · 슬라이드 1–15 · 참고문헌 · 감사 / 베트남어·한국어 대역)</w:t>
       </w:r>
     </w:p>
     <w:p>
@@ -57,7 +57,7 @@
         <w:rPr>
           <w:color w:val="555555"/>
         </w:rPr>
-        <w:t xml:space="preserve">Nguyễn Thị Hương – Park Yeon-Kwan · Trường Đại học Ngoại ngữ Hàn Quốc (HUFS)</w:t>
+        <w:t xml:space="preserve">Nguyễn Thị Hương (Học viên cao học) – Park Yeon Kwan (Giáo sư kiêm Trưởng khoa Tiếng Việt) · Trường Đại học Ngoại ngữ Hàn Quốc</w:t>
       </w:r>
     </w:p>
     <w:p>
@@ -95,7 +95,7 @@
           <w:sz w:val="18"/>
           <w:szCs w:val="18"/>
         </w:rPr>
-        <w:t xml:space="preserve">  (인사 · 연구 질문 제시 (표지 · 슬라이드 1, 약 0.5분))</w:t>
+        <w:t xml:space="preserve">  (인사 · 발표 제목 (표지, 약 0.5분))</w:t>
       </w:r>
     </w:p>
     <w:p>
@@ -108,7 +108,7 @@
           <w:sz w:val="21"/>
           <w:szCs w:val="21"/>
         </w:rPr>
-        <w:t xml:space="preserve">I. Gia Định Báo và câu hỏi nghiên cứu</w:t>
+        <w:t xml:space="preserve">I. Đặt vấn đề</w:t>
       </w:r>
       <w:r>
         <w:rPr>
@@ -117,7 +117,7 @@
           <w:sz w:val="18"/>
           <w:szCs w:val="18"/>
         </w:rPr>
-        <w:t xml:space="preserve">  (자딘보와 연구 질문 (슬라이드 2–2b, 약 1.5분))</w:t>
+        <w:t xml:space="preserve">  (문제 제기 (슬라이드 1 · 2 · 2b, 약 2분))</w:t>
       </w:r>
     </w:p>
     <w:p>
@@ -174,7 +174,7 @@
           <w:sz w:val="21"/>
           <w:szCs w:val="21"/>
         </w:rPr>
-        <w:t xml:space="preserve">IV. Thay đổi bắt đầu từ khi nào?</w:t>
+        <w:t xml:space="preserve">IV. Thảo luận</w:t>
       </w:r>
       <w:r>
         <w:rPr>
@@ -183,7 +183,7 @@
           <w:sz w:val="18"/>
           <w:szCs w:val="18"/>
         </w:rPr>
-        <w:t xml:space="preserve">  (변화는 언제 시작되었는가 (슬라이드 14, 약 1.5분))</w:t>
+        <w:t xml:space="preserve">  (논의: 변화는 언제 시작되었는가 (슬라이드 14, 약 1.5분))</w:t>
       </w:r>
     </w:p>
     <w:p>
@@ -219,7 +219,7 @@
           <w:sz w:val="18"/>
           <w:szCs w:val="18"/>
         </w:rPr>
-        <w:t xml:space="preserve">읽는 법: 초록 줄(↪ 연결 멘트) = 파트를 넘어갈 때 하는 말 / 검은 줄 = 베트남어 발표 문장 / 회색 줄 = 한국어 번역 / 파란 칸 = 화면 조작 안내(읽지 않음)</w:t>
+        <w:t xml:space="preserve">읽는 법: 초록 줄(↪ 연결 멘트) = 파트를 넘어갈 때 하는 말 / 검은 줄 = 베트남어 발표 문장 / 회색 줄 = 한국어 번역 / 파란 칸 = 화면 조작 안내(읽지 않음). 화면 조작: ‘넘김’ = 다음 슬라이드, ‘클릭’ = 같은 슬라이드 안의 다음 단계 (→ 키 또는 마우스 클릭). M 키 = 슬라이드 목록, ← 키 = 뒤로.</w:t>
       </w:r>
     </w:p>
     <w:p>
@@ -251,7 +251,7 @@
           <w:rFonts w:ascii="맑은 고딕" w:hAnsi="맑은 고딕" w:cs="맑은 고딕" w:eastAsia="맑은 고딕"/>
           <w:color w:val="6B6B6B"/>
         </w:rPr>
-        <w:t xml:space="preserve">인사 · 연구 질문 제시 (표지 · 슬라이드 1, 약 0.5분)</w:t>
+        <w:t xml:space="preserve">인사 · 발표 제목 (표지, 약 0.5분)</w:t>
       </w:r>
     </w:p>
     <w:p>
@@ -268,7 +268,7 @@
           <w:sz w:val="18"/>
           <w:szCs w:val="18"/>
         </w:rPr>
-        <w:t xml:space="preserve">▶ 화면: 표지 — 연구 제목 · 발표자 · 학술대회</w:t>
+        <w:t xml:space="preserve">▶ 화면: 표지 — 학술대회명 · 발표 제목 · 발표자 2인</w:t>
       </w:r>
     </w:p>
     <w:p>
@@ -309,7 +309,7 @@
           <w:sz w:val="25"/>
           <w:szCs w:val="25"/>
         </w:rPr>
-        <w:t xml:space="preserve">Hôm nay, thay mặt nhóm nghiên cứu cùng Giáo sư Park Yeon-Kwan, tôi xin trình bày báo cáo “Từ Ernest Potteaux đến Trương Vĩnh Ký: biến đổi nội dung Gia Định Báo qua Công vụ, Tạp vụ, Giá chợ (1865–1871)”.</w:t>
+        <w:t xml:space="preserve">Hôm nay, thay mặt nhóm nghiên cứu cùng Giáo sư Park Yeon Kwan, Trưởng khoa Tiếng Việt, tôi xin trình bày báo cáo “Từ Ernest Potteaux đến Trương Vĩnh Ký: biến đổi nội dung Gia Định Báo qua Công vụ, Tạp vụ, Giá chợ (1865–1871)”.</w:t>
       </w:r>
     </w:p>
     <w:p>
@@ -324,7 +324,39 @@
           <w:sz w:val="19"/>
           <w:szCs w:val="19"/>
         </w:rPr>
-        <w:t xml:space="preserve">오늘은 박연관 교수님과 함께한 연구팀을 대표하여 ‘에르네스트 포토에서 쯔엉 빈 끼까지: 공무·잡무·시장 물가 난을 통해 본 『자딘보』 내용의 변화(1865–1871)’를 발표하겠습니다.</w:t>
+        <w:t xml:space="preserve">오늘은 베트남어과 학과장이신 박연관 교수님과 함께한 연구팀을 대표하여 ‘에르네스트 포토에서 쯔엉 빈 끼까지: 공무·잡무·시장 물가 난을 통해 본 『자딘보』 내용의 변화(1865–1871)’를 발표하겠습니다.</w:t>
+      </w:r>
+    </w:p>
+    <w:p>
+      <w:r>
+        <w:br w:type="page"/>
+      </w:r>
+    </w:p>
+    <w:p>
+      <w:pPr>
+        <w:pStyle w:val="1"/>
+        <w:spacing w:after="60"/>
+      </w:pPr>
+      <w:r>
+        <w:rPr>
+          <w:color w:val="1F3864"/>
+        </w:rPr>
+        <w:t xml:space="preserve">I. Đặt vấn đề</w:t>
+      </w:r>
+    </w:p>
+    <w:p>
+      <w:pPr>
+        <w:pBdr>
+          <w:bottom w:val="single" w:sz="8" w:space="4" w:color="1F3864"/>
+        </w:pBdr>
+        <w:spacing w:after="160"/>
+      </w:pPr>
+      <w:r>
+        <w:rPr>
+          <w:rFonts w:ascii="맑은 고딕" w:hAnsi="맑은 고딕" w:cs="맑은 고딕" w:eastAsia="맑은 고딕"/>
+          <w:color w:val="6B6B6B"/>
+        </w:rPr>
+        <w:t xml:space="preserve">문제 제기 (슬라이드 1 · 2 · 2b, 약 2분)</w:t>
       </w:r>
     </w:p>
     <w:p>
@@ -398,7 +430,7 @@
           <w:sz w:val="18"/>
           <w:szCs w:val="18"/>
         </w:rPr>
-        <w:t xml:space="preserve">▶ 화면: 슬라이드 1 — 16·09·1869 (클릭)</w:t>
+        <w:t xml:space="preserve">▶ 화면: 넘김 → 슬라이드 1 “Câu hỏi nghiên cứu” — 16·09·1869</w:t>
       </w:r>
     </w:p>
     <w:p>
@@ -427,38 +459,6 @@
           <w:szCs w:val="19"/>
         </w:rPr>
         <w:t xml:space="preserve">1869년 9월 16일. 이날은 신문의 역사에서 단절점이었을까요, 아니면 하나의 전환점이었을까요?</w:t>
-      </w:r>
-    </w:p>
-    <w:p>
-      <w:r>
-        <w:br w:type="page"/>
-      </w:r>
-    </w:p>
-    <w:p>
-      <w:pPr>
-        <w:pStyle w:val="1"/>
-        <w:spacing w:after="60"/>
-      </w:pPr>
-      <w:r>
-        <w:rPr>
-          <w:color w:val="1F3864"/>
-        </w:rPr>
-        <w:t xml:space="preserve">I. Gia Định Báo và câu hỏi nghiên cứu</w:t>
-      </w:r>
-    </w:p>
-    <w:p>
-      <w:pPr>
-        <w:pBdr>
-          <w:bottom w:val="single" w:sz="8" w:space="4" w:color="1F3864"/>
-        </w:pBdr>
-        <w:spacing w:after="160"/>
-      </w:pPr>
-      <w:r>
-        <w:rPr>
-          <w:rFonts w:ascii="맑은 고딕" w:hAnsi="맑은 고딕" w:cs="맑은 고딕" w:eastAsia="맑은 고딕"/>
-          <w:color w:val="6B6B6B"/>
-        </w:rPr>
-        <w:t xml:space="preserve">자딘보와 연구 질문 (슬라이드 2–2b, 약 1.5분)</w:t>
       </w:r>
     </w:p>
     <w:p>
@@ -532,7 +532,7 @@
           <w:sz w:val="18"/>
           <w:szCs w:val="18"/>
         </w:rPr>
-        <w:t xml:space="preserve">▶ 화면: 슬라이드 2 — 1866년 제2호 1면 · 1865.4.15 · 1869.9.16</w:t>
+        <w:t xml:space="preserve">▶ 화면: 넘김 → 슬라이드 2 “Gia Định Báo và mốc chuyển giao 16/9/1869” — 1866년 제2호 1면 · 주필 서명</w:t>
       </w:r>
     </w:p>
     <w:p>
@@ -605,7 +605,7 @@
           <w:sz w:val="18"/>
           <w:szCs w:val="18"/>
         </w:rPr>
-        <w:t xml:space="preserve">▶ 화면: 클릭 ×2 — Tạp vụ, Giá chợ 라벨이 차례로 나타남</w:t>
+        <w:t xml:space="preserve">▶ 화면: 클릭 ×2 — Tạp vụ → Giá chợ 라벨</w:t>
       </w:r>
     </w:p>
     <w:p>
@@ -707,7 +707,7 @@
           <w:sz w:val="18"/>
           <w:szCs w:val="18"/>
         </w:rPr>
-        <w:t xml:space="preserve">▶ 화면: 슬라이드 2b — 선행 연구 인용</w:t>
+        <w:t xml:space="preserve">▶ 화면: 넘김 → 슬라이드 2b “Nhận định của các nghiên cứu trước” — 인용 3개</w:t>
       </w:r>
     </w:p>
     <w:p>
@@ -752,7 +752,7 @@
           <w:sz w:val="18"/>
           <w:szCs w:val="18"/>
         </w:rPr>
-        <w:t xml:space="preserve">▶ 화면: 클릭 — “Nhưng…” 상자</w:t>
+        <w:t xml:space="preserve">▶ 화면: 클릭 — “Nhưng…” 상자 · 연구 질문</w:t>
       </w:r>
     </w:p>
     <w:p>
@@ -886,7 +886,7 @@
           <w:sz w:val="18"/>
           <w:szCs w:val="18"/>
         </w:rPr>
-        <w:t xml:space="preserve">▶ 화면: 슬라이드 3 — 136호 격자 · 45/63 · 15/72</w:t>
+        <w:t xml:space="preserve">▶ 화면: 넘김 → 슬라이드 3 “Tư liệu: 61 trên 136 số báo hiện còn” — 136호 격자 · 45/63 · 15/72</w:t>
       </w:r>
     </w:p>
     <w:p>
@@ -1016,7 +1016,7 @@
           <w:sz w:val="18"/>
           <w:szCs w:val="18"/>
         </w:rPr>
-        <w:t xml:space="preserve">▶ 화면: 슬라이드 4 — 1866년 제2호 4면 (클릭 ×2: 난 → 텍스트 단위)</w:t>
+        <w:t xml:space="preserve">▶ 화면: 넘김 → 슬라이드 4 “Quy trình: từ trang báo đến đơn vị văn bản” (클릭 ×2: 난 → 텍스트 단위)</w:t>
       </w:r>
     </w:p>
     <w:p>
@@ -1061,7 +1061,7 @@
           <w:sz w:val="18"/>
           <w:szCs w:val="18"/>
         </w:rPr>
-        <w:t xml:space="preserve">▶ 화면: 슬라이드 5 — 세 축: 난 · 형식 · 주제</w:t>
+        <w:t xml:space="preserve">▶ 화면: 넘김 → 슬라이드 5 “Ba trục phân tích độc lập”</w:t>
       </w:r>
     </w:p>
     <w:p>
@@ -1106,7 +1106,7 @@
           <w:sz w:val="18"/>
           <w:szCs w:val="18"/>
         </w:rPr>
-        <w:t xml:space="preserve">▶ 화면: 슬라이드 6–7 — 형식·주제 코드북 표 (설명 없이 빠르게 넘김)</w:t>
+        <w:t xml:space="preserve">▶ 화면: 넘김 → 슬라이드 6 “Khung mã hóa (1)” → 넘김 → 슬라이드 7 “Khung mã hóa (2)” (표는 설명 없이 빠르게)</w:t>
       </w:r>
     </w:p>
     <w:p>
@@ -1151,7 +1151,7 @@
           <w:sz w:val="18"/>
           <w:szCs w:val="18"/>
         </w:rPr>
-        <w:t xml:space="preserve">▶ 화면: 슬라이드 8 — 원문 예시 두 개</w:t>
+        <w:t xml:space="preserve">▶ 화면: 넘김 → 슬라이드 8 “Ví dụ áp dụng ba trục mã hóa” — 원문 예시 2개</w:t>
       </w:r>
     </w:p>
     <w:p>
@@ -1196,7 +1196,7 @@
           <w:sz w:val="18"/>
           <w:szCs w:val="18"/>
         </w:rPr>
-        <w:t xml:space="preserve">▶ 화면: 슬라이드 9 — 61 · 888 · 11 · 15 (클릭 ×4)</w:t>
+        <w:t xml:space="preserve">▶ 화면: 넘김 → 슬라이드 9 “Quy mô dữ liệu” (클릭 ×4: 61 → 888 → 11 → 15)</w:t>
       </w:r>
     </w:p>
     <w:p>
@@ -1330,7 +1330,7 @@
           <w:sz w:val="18"/>
           <w:szCs w:val="18"/>
         </w:rPr>
-        <w:t xml:space="preserve">▶ 화면: 슬라이드 10 — 연도별 난 존재 비율 (클릭 ×2)</w:t>
+        <w:t xml:space="preserve">▶ 화면: 넘김 → 슬라이드 10 “Kết quả 1 · Cấu trúc” (클릭 ×2: 1869 → 1870–1871)</w:t>
       </w:r>
     </w:p>
     <w:p>
@@ -1375,7 +1375,7 @@
           <w:sz w:val="18"/>
           <w:szCs w:val="18"/>
         </w:rPr>
-        <w:t xml:space="preserve">▶ 화면: 슬라이드 11 — 세 개의 원 (클릭 ×2)</w:t>
+        <w:t xml:space="preserve">▶ 화면: 넘김 → 슬라이드 11 “Kết quả 2 · Mức độ chuyên biệt” (클릭 ×2: Giá chợ → Tạp vụ)</w:t>
       </w:r>
     </w:p>
     <w:p>
@@ -1420,7 +1420,7 @@
           <w:sz w:val="18"/>
           <w:szCs w:val="18"/>
         </w:rPr>
-        <w:t xml:space="preserve">▶ 화면: 슬라이드 12 — Nhưng… → 208 → 97 → 53.4% → 문장 (클릭 ×5)</w:t>
+        <w:t xml:space="preserve">▶ 화면: 넘김 → 슬라이드 12 “Kết quả 3 · Kinh tế ngoài Giá chợ” (클릭 ×5: Nhưng… → 208 → 97 → 53,4% → 결론 문장)</w:t>
       </w:r>
     </w:p>
     <w:p>
@@ -1465,7 +1465,7 @@
           <w:sz w:val="18"/>
           <w:szCs w:val="18"/>
         </w:rPr>
-        <w:t xml:space="preserve">▶ 화면: 슬라이드 13 — 잡무란 막대 그래프 (클릭)</w:t>
+        <w:t xml:space="preserve">▶ 화면: 넘김 → 슬라이드 13 “Kết quả 4 · Tạp vụ” (클릭: 쯔엉 빈 끼 시기 막대 · 1870년 제10호 사진)</w:t>
       </w:r>
     </w:p>
     <w:p>
@@ -1510,7 +1510,7 @@
         <w:rPr>
           <w:color w:val="1F3864"/>
         </w:rPr>
-        <w:t xml:space="preserve">IV. Thay đổi bắt đầu từ khi nào?</w:t>
+        <w:t xml:space="preserve">IV. Thảo luận</w:t>
       </w:r>
     </w:p>
     <w:p>
@@ -1525,7 +1525,7 @@
           <w:rFonts w:ascii="맑은 고딕" w:hAnsi="맑은 고딕" w:cs="맑은 고딕" w:eastAsia="맑은 고딕"/>
           <w:color w:val="6B6B6B"/>
         </w:rPr>
-        <w:t xml:space="preserve">변화는 언제 시작되었는가 (슬라이드 14, 약 1.5분)</w:t>
+        <w:t xml:space="preserve">논의: 변화는 언제 시작되었는가 (슬라이드 14, 약 1.5분)</w:t>
       </w:r>
     </w:p>
     <w:p>
@@ -1599,7 +1599,7 @@
           <w:sz w:val="18"/>
           <w:szCs w:val="18"/>
         </w:rPr>
-        <w:t xml:space="preserve">▶ 화면: 슬라이드 14 — 세 단계 그래프 (클릭 ×3: 선 → 1869.9.16 표시 → 결론 문장)</w:t>
+        <w:t xml:space="preserve">▶ 화면: 넘김 → 슬라이드 14 “Thay đổi bắt đầu từ khi nào?” (클릭 ×3: 선 → 1869.9.16 표시 → 결론 문장)</w:t>
       </w:r>
     </w:p>
     <w:p>
@@ -1789,7 +1789,7 @@
           <w:sz w:val="18"/>
           <w:szCs w:val="18"/>
         </w:rPr>
-        <w:t xml:space="preserve">▶ 화면: 슬라이드 15 — 전환 · 재구조화 · 분화 (클릭)</w:t>
+        <w:t xml:space="preserve">▶ 화면: 넘김 → 슬라이드 15 “Ba đặc điểm của quá trình biến đổi” (클릭: 결론 문장)</w:t>
       </w:r>
     </w:p>
     <w:p>
@@ -1947,7 +1947,7 @@
           <w:sz w:val="18"/>
           <w:szCs w:val="18"/>
         </w:rPr>
-        <w:t xml:space="preserve">▶ 화면: 참고문헌 → 감사 슬라이드</w:t>
+        <w:t xml:space="preserve">▶ 화면: 넘김 → 참고문헌 → 넘김 → 감사 슬라이드 (질의응답 동안 감사 슬라이드 유지)</w:t>
       </w:r>
     </w:p>
     <w:p>

</xml_diff>